<commit_message>
decent data analysis + doc retrieving + gap analysis
</commit_message>
<xml_diff>
--- a/Documents RAG/Note de Cadrage - Angleterre - Montants(Eng).docx
+++ b/Documents RAG/Note de Cadrage - Angleterre - Montants(Eng).docx
@@ -4,714 +4,549 @@
   <w:body>
     <w:p>
       <w:pPr>
-        <w:rPr>
-          <w:rFonts w:ascii="Segoe UI" w:eastAsia="Times New Roman" w:hAnsi="Segoe UI" w:cs="Segoe UI"/>
-          <w:b/>
-          <w:bCs/>
-          <w:color w:val="404040"/>
-          <w:kern w:val="0"/>
+        <w:pStyle w:val="Titre3"/>
+        <w:rPr>
+          <w:rFonts w:ascii="Segoe UI" w:hAnsi="Segoe UI" w:cs="Segoe UI"/>
+          <w:color w:val="404040"/>
           <w:sz w:val="27"/>
           <w:szCs w:val="27"/>
-          <w:lang w:val="en-US" w:eastAsia="fr-FR"/>
-          <w14:ligatures w14:val="none"/>
+          <w:lang w:val="en-US"/>
         </w:rPr>
       </w:pPr>
       <w:r>
         <w:rPr>
-          <w:rFonts w:ascii="Segoe UI" w:eastAsia="Times New Roman" w:hAnsi="Segoe UI" w:cs="Segoe UI"/>
-          <w:b/>
-          <w:bCs/>
-          <w:color w:val="404040"/>
-          <w:kern w:val="0"/>
-          <w:sz w:val="27"/>
-          <w:szCs w:val="27"/>
-          <w:lang w:val="en-US" w:eastAsia="fr-FR"/>
-          <w14:ligatures w14:val="none"/>
-        </w:rPr>
-        <w:t>United Kingdom (UK, Ireland)</w:t>
+          <w:rStyle w:val="lev"/>
+          <w:rFonts w:ascii="Segoe UI" w:hAnsi="Segoe UI" w:cs="Segoe UI"/>
+          <w:b w:val="0"/>
+          <w:bCs w:val="0"/>
+          <w:color w:val="404040"/>
+          <w:lang w:val="en-US"/>
+        </w:rPr>
+        <w:t>England: United Kingdom &amp; Ireland</w:t>
       </w:r>
     </w:p>
     <w:p>
       <w:pPr>
-        <w:rPr>
-          <w:rFonts w:ascii="Segoe UI" w:eastAsia="Times New Roman" w:hAnsi="Segoe UI" w:cs="Segoe UI"/>
-          <w:b/>
-          <w:bCs/>
-          <w:color w:val="404040"/>
-          <w:kern w:val="0"/>
-          <w:sz w:val="27"/>
-          <w:szCs w:val="27"/>
-          <w:lang w:val="en-US" w:eastAsia="fr-FR"/>
-          <w14:ligatures w14:val="none"/>
+        <w:pStyle w:val="Titre4"/>
+        <w:rPr>
+          <w:rFonts w:ascii="Segoe UI" w:hAnsi="Segoe UI" w:cs="Segoe UI"/>
+          <w:color w:val="404040"/>
+          <w:lang w:val="en-US"/>
         </w:rPr>
       </w:pPr>
       <w:r>
         <w:rPr>
-          <w:rFonts w:ascii="Segoe UI" w:eastAsia="Times New Roman" w:hAnsi="Segoe UI" w:cs="Segoe UI"/>
-          <w:b/>
-          <w:bCs/>
-          <w:color w:val="404040"/>
-          <w:kern w:val="0"/>
-          <w:sz w:val="27"/>
-          <w:szCs w:val="27"/>
-          <w:lang w:val="en-US" w:eastAsia="fr-FR"/>
-          <w14:ligatures w14:val="none"/>
-        </w:rPr>
-        <w:t>2024 Performance Analysis</w:t>
+          <w:rStyle w:val="lev"/>
+          <w:rFonts w:ascii="Segoe UI" w:hAnsi="Segoe UI" w:cs="Segoe UI"/>
+          <w:b w:val="0"/>
+          <w:bCs w:val="0"/>
+          <w:color w:val="404040"/>
+          <w:lang w:val="en-US"/>
+        </w:rPr>
+        <w:t>United Kingdom</w:t>
       </w:r>
     </w:p>
     <w:p>
       <w:pPr>
+        <w:pStyle w:val="NormalWeb"/>
         <w:numPr>
           <w:ilvl w:val="0"/>
-          <w:numId w:val="16"/>
+          <w:numId w:val="19"/>
         </w:numPr>
-        <w:rPr>
-          <w:rFonts w:ascii="Segoe UI" w:eastAsia="Times New Roman" w:hAnsi="Segoe UI" w:cs="Segoe UI"/>
-          <w:b/>
-          <w:bCs/>
-          <w:color w:val="404040"/>
-          <w:kern w:val="0"/>
-          <w:sz w:val="27"/>
-          <w:szCs w:val="27"/>
-          <w:lang w:val="en-US" w:eastAsia="fr-FR"/>
-          <w14:ligatures w14:val="none"/>
+        <w:spacing w:before="0" w:beforeAutospacing="0" w:after="60" w:afterAutospacing="0"/>
+        <w:rPr>
+          <w:rFonts w:ascii="Segoe UI" w:hAnsi="Segoe UI" w:cs="Segoe UI"/>
+          <w:color w:val="404040"/>
         </w:rPr>
       </w:pPr>
       <w:r>
         <w:rPr>
-          <w:rFonts w:ascii="Segoe UI" w:eastAsia="Times New Roman" w:hAnsi="Segoe UI" w:cs="Segoe UI"/>
-          <w:b/>
-          <w:bCs/>
-          <w:color w:val="404040"/>
-          <w:kern w:val="0"/>
-          <w:sz w:val="27"/>
-          <w:szCs w:val="27"/>
-          <w:lang w:val="en-US" w:eastAsia="fr-FR"/>
-          <w14:ligatures w14:val="none"/>
-        </w:rPr>
-        <w:t>Total Sales: €309,687.5k (Stable monthly growth: +3%).</w:t>
+          <w:rStyle w:val="lev"/>
+          <w:rFonts w:ascii="Segoe UI" w:eastAsiaTheme="majorEastAsia" w:hAnsi="Segoe UI" w:cs="Segoe UI"/>
+          <w:color w:val="404040"/>
+        </w:rPr>
+        <w:t>Sales/Revenues</w:t>
+      </w:r>
+      <w:r>
+        <w:rPr>
+          <w:rFonts w:ascii="Segoe UI" w:hAnsi="Segoe UI" w:cs="Segoe UI"/>
+          <w:color w:val="404040"/>
+        </w:rPr>
+        <w:t>:</w:t>
       </w:r>
     </w:p>
     <w:p>
       <w:pPr>
+        <w:pStyle w:val="NormalWeb"/>
         <w:numPr>
-          <w:ilvl w:val="0"/>
-          <w:numId w:val="16"/>
+          <w:ilvl w:val="1"/>
+          <w:numId w:val="19"/>
         </w:numPr>
-        <w:rPr>
-          <w:rFonts w:ascii="Segoe UI" w:eastAsia="Times New Roman" w:hAnsi="Segoe UI" w:cs="Segoe UI"/>
-          <w:b/>
-          <w:bCs/>
-          <w:color w:val="404040"/>
-          <w:kern w:val="0"/>
-          <w:sz w:val="27"/>
-          <w:szCs w:val="27"/>
-          <w:lang w:val="en-US" w:eastAsia="fr-FR"/>
-          <w14:ligatures w14:val="none"/>
+        <w:spacing w:before="0" w:beforeAutospacing="0" w:after="0" w:afterAutospacing="0"/>
+        <w:rPr>
+          <w:rStyle w:val="lev"/>
+          <w:rFonts w:ascii="Segoe UI" w:hAnsi="Segoe UI" w:cs="Segoe UI"/>
+          <w:b w:val="0"/>
+          <w:bCs w:val="0"/>
+          <w:color w:val="404040"/>
+          <w:lang w:val="en-US"/>
         </w:rPr>
       </w:pPr>
       <w:r>
         <w:rPr>
-          <w:rFonts w:ascii="Segoe UI" w:eastAsia="Times New Roman" w:hAnsi="Segoe UI" w:cs="Segoe UI"/>
-          <w:b/>
-          <w:bCs/>
-          <w:color w:val="404040"/>
-          <w:kern w:val="0"/>
-          <w:sz w:val="27"/>
-          <w:szCs w:val="27"/>
-          <w:lang w:val="en-US" w:eastAsia="fr-FR"/>
-          <w14:ligatures w14:val="none"/>
-        </w:rPr>
-        <w:t>Total Costs: €89,761.9k (Minimal fluctuations: +1% monthly).</w:t>
+          <w:rStyle w:val="lev"/>
+          <w:rFonts w:ascii="Segoe UI" w:eastAsiaTheme="majorEastAsia" w:hAnsi="Segoe UI" w:cs="Segoe UI"/>
+          <w:color w:val="404040"/>
+          <w:lang w:val="en-US"/>
+        </w:rPr>
+        <w:t>Passenger Revenues</w:t>
+      </w:r>
+      <w:r>
+        <w:rPr>
+          <w:rStyle w:val="lev"/>
+          <w:rFonts w:ascii="Segoe UI" w:eastAsiaTheme="majorEastAsia" w:hAnsi="Segoe UI" w:cs="Segoe UI"/>
+          <w:color w:val="404040"/>
+          <w:lang w:val="en-US"/>
+        </w:rPr>
+        <w:t>:</w:t>
       </w:r>
     </w:p>
     <w:p>
       <w:pPr>
-        <w:numPr>
-          <w:ilvl w:val="0"/>
-          <w:numId w:val="16"/>
-        </w:numPr>
-        <w:rPr>
-          <w:rFonts w:ascii="Segoe UI" w:eastAsia="Times New Roman" w:hAnsi="Segoe UI" w:cs="Segoe UI"/>
-          <w:b/>
-          <w:bCs/>
-          <w:color w:val="404040"/>
-          <w:kern w:val="0"/>
-          <w:sz w:val="27"/>
-          <w:szCs w:val="27"/>
-          <w:lang w:eastAsia="fr-FR"/>
-          <w14:ligatures w14:val="none"/>
+        <w:pStyle w:val="NormalWeb"/>
+        <w:spacing w:before="0" w:beforeAutospacing="0" w:after="0" w:afterAutospacing="0"/>
+        <w:ind w:left="1440"/>
+        <w:rPr>
+          <w:rFonts w:ascii="Segoe UI" w:hAnsi="Segoe UI" w:cs="Segoe UI"/>
+          <w:color w:val="404040"/>
+          <w:lang w:val="en-US"/>
         </w:rPr>
       </w:pPr>
       <w:r>
         <w:rPr>
-          <w:rFonts w:ascii="Segoe UI" w:eastAsia="Times New Roman" w:hAnsi="Segoe UI" w:cs="Segoe UI"/>
-          <w:b/>
-          <w:bCs/>
-          <w:color w:val="404040"/>
-          <w:kern w:val="0"/>
-          <w:sz w:val="27"/>
-          <w:szCs w:val="27"/>
-          <w:lang w:eastAsia="fr-FR"/>
-          <w14:ligatures w14:val="none"/>
-        </w:rPr>
-        <w:t xml:space="preserve">Net </w:t>
+          <w:rStyle w:val="lev"/>
+          <w:rFonts w:ascii="Segoe UI" w:eastAsiaTheme="majorEastAsia" w:hAnsi="Segoe UI" w:cs="Segoe UI"/>
+          <w:color w:val="404040"/>
+          <w:lang w:val="en-US"/>
+        </w:rPr>
+        <w:t>Target</w:t>
       </w:r>
-      <w:proofErr w:type="spellStart"/>
       <w:r>
         <w:rPr>
-          <w:rFonts w:ascii="Segoe UI" w:eastAsia="Times New Roman" w:hAnsi="Segoe UI" w:cs="Segoe UI"/>
-          <w:b/>
-          <w:bCs/>
-          <w:color w:val="404040"/>
-          <w:kern w:val="0"/>
-          <w:sz w:val="27"/>
-          <w:szCs w:val="27"/>
-          <w:lang w:eastAsia="fr-FR"/>
-          <w14:ligatures w14:val="none"/>
-        </w:rPr>
-        <w:t>Margin</w:t>
+          <w:rStyle w:val="lev"/>
+          <w:rFonts w:ascii="Segoe UI" w:eastAsiaTheme="majorEastAsia" w:hAnsi="Segoe UI" w:cs="Segoe UI"/>
+          <w:color w:val="404040"/>
+          <w:lang w:val="en-US"/>
+        </w:rPr>
+        <w:t xml:space="preserve"> 2025</w:t>
       </w:r>
-      <w:proofErr w:type="spellEnd"/>
       <w:r>
         <w:rPr>
-          <w:rFonts w:ascii="Segoe UI" w:eastAsia="Times New Roman" w:hAnsi="Segoe UI" w:cs="Segoe UI"/>
-          <w:b/>
-          <w:bCs/>
-          <w:color w:val="404040"/>
-          <w:kern w:val="0"/>
-          <w:sz w:val="27"/>
-          <w:szCs w:val="27"/>
-          <w:lang w:eastAsia="fr-FR"/>
-          <w14:ligatures w14:val="none"/>
-        </w:rPr>
-        <w:t>: 71% (Best-</w:t>
+          <w:rFonts w:ascii="Segoe UI" w:hAnsi="Segoe UI" w:cs="Segoe UI"/>
+          <w:color w:val="404040"/>
+          <w:lang w:val="en-US"/>
+        </w:rPr>
+        <w:t>: €16</w:t>
       </w:r>
-      <w:proofErr w:type="spellStart"/>
       <w:r>
         <w:rPr>
-          <w:rFonts w:ascii="Segoe UI" w:eastAsia="Times New Roman" w:hAnsi="Segoe UI" w:cs="Segoe UI"/>
-          <w:b/>
-          <w:bCs/>
-          <w:color w:val="404040"/>
-          <w:kern w:val="0"/>
-          <w:sz w:val="27"/>
-          <w:szCs w:val="27"/>
-          <w:lang w:eastAsia="fr-FR"/>
-          <w14:ligatures w14:val="none"/>
-        </w:rPr>
-        <w:t>performing</w:t>
+          <w:rFonts w:ascii="Segoe UI" w:hAnsi="Segoe UI" w:cs="Segoe UI"/>
+          <w:color w:val="404040"/>
+          <w:lang w:val="en-US"/>
+        </w:rPr>
+        <w:t>2</w:t>
       </w:r>
-      <w:proofErr w:type="spellEnd"/>
       <w:r>
         <w:rPr>
-          <w:rFonts w:ascii="Segoe UI" w:eastAsia="Times New Roman" w:hAnsi="Segoe UI" w:cs="Segoe UI"/>
-          <w:b/>
-          <w:bCs/>
-          <w:color w:val="404040"/>
-          <w:kern w:val="0"/>
-          <w:sz w:val="27"/>
-          <w:szCs w:val="27"/>
-          <w:lang w:eastAsia="fr-FR"/>
-          <w14:ligatures w14:val="none"/>
-        </w:rPr>
-        <w:t xml:space="preserve"> </w:t>
+          <w:rFonts w:ascii="Segoe UI" w:hAnsi="Segoe UI" w:cs="Segoe UI"/>
+          <w:color w:val="404040"/>
+          <w:lang w:val="en-US"/>
+        </w:rPr>
+        <w:t>,</w:t>
       </w:r>
-      <w:proofErr w:type="spellStart"/>
       <w:r>
         <w:rPr>
-          <w:rFonts w:ascii="Segoe UI" w:eastAsia="Times New Roman" w:hAnsi="Segoe UI" w:cs="Segoe UI"/>
-          <w:b/>
-          <w:bCs/>
-          <w:color w:val="404040"/>
-          <w:kern w:val="0"/>
-          <w:sz w:val="27"/>
-          <w:szCs w:val="27"/>
-          <w:lang w:eastAsia="fr-FR"/>
-          <w14:ligatures w14:val="none"/>
-        </w:rPr>
-        <w:t>region</w:t>
+          <w:rFonts w:ascii="Segoe UI" w:hAnsi="Segoe UI" w:cs="Segoe UI"/>
+          <w:color w:val="404040"/>
+          <w:lang w:val="en-US"/>
+        </w:rPr>
+        <w:t>000</w:t>
       </w:r>
-      <w:proofErr w:type="spellEnd"/>
       <w:r>
         <w:rPr>
-          <w:rFonts w:ascii="Segoe UI" w:eastAsia="Times New Roman" w:hAnsi="Segoe UI" w:cs="Segoe UI"/>
-          <w:b/>
-          <w:bCs/>
-          <w:color w:val="404040"/>
-          <w:kern w:val="0"/>
-          <w:sz w:val="27"/>
-          <w:szCs w:val="27"/>
-          <w:lang w:eastAsia="fr-FR"/>
-          <w14:ligatures w14:val="none"/>
-        </w:rPr>
-        <w:t>).</w:t>
+          <w:rFonts w:ascii="Segoe UI" w:hAnsi="Segoe UI" w:cs="Segoe UI"/>
+          <w:color w:val="404040"/>
+          <w:lang w:val="en-US"/>
+        </w:rPr>
+        <w:t>k with premium-class incentives.</w:t>
       </w:r>
     </w:p>
     <w:p>
       <w:pPr>
-        <w:rPr>
-          <w:rFonts w:ascii="Segoe UI" w:eastAsia="Times New Roman" w:hAnsi="Segoe UI" w:cs="Segoe UI"/>
-          <w:b/>
-          <w:bCs/>
-          <w:color w:val="404040"/>
-          <w:kern w:val="0"/>
-          <w:sz w:val="27"/>
-          <w:szCs w:val="27"/>
-          <w:lang w:eastAsia="fr-FR"/>
-          <w14:ligatures w14:val="none"/>
-        </w:rPr>
-      </w:pPr>
-      <w:r>
-        <w:rPr>
-          <w:rFonts w:ascii="Segoe UI" w:eastAsia="Times New Roman" w:hAnsi="Segoe UI" w:cs="Segoe UI"/>
-          <w:b/>
-          <w:bCs/>
-          <w:color w:val="404040"/>
-          <w:kern w:val="0"/>
-          <w:sz w:val="27"/>
-          <w:szCs w:val="27"/>
-          <w:lang w:eastAsia="fr-FR"/>
-          <w14:ligatures w14:val="none"/>
-        </w:rPr>
-        <w:t xml:space="preserve">2025 </w:t>
-      </w:r>
+        <w:pStyle w:val="NormalWeb"/>
+        <w:numPr>
+          <w:ilvl w:val="0"/>
+          <w:numId w:val="19"/>
+        </w:numPr>
+        <w:spacing w:before="0" w:beforeAutospacing="0" w:after="60" w:afterAutospacing="0"/>
+        <w:rPr>
+          <w:rFonts w:ascii="Segoe UI" w:hAnsi="Segoe UI" w:cs="Segoe UI"/>
+          <w:color w:val="404040"/>
+        </w:rPr>
+      </w:pPr>
       <w:proofErr w:type="spellStart"/>
       <w:r>
         <w:rPr>
-          <w:rFonts w:ascii="Segoe UI" w:eastAsia="Times New Roman" w:hAnsi="Segoe UI" w:cs="Segoe UI"/>
-          <w:b/>
-          <w:bCs/>
-          <w:color w:val="404040"/>
-          <w:kern w:val="0"/>
-          <w:sz w:val="27"/>
-          <w:szCs w:val="27"/>
-          <w:lang w:eastAsia="fr-FR"/>
-          <w14:ligatures w14:val="none"/>
-        </w:rPr>
-        <w:t>Targets</w:t>
-      </w:r>
-      <w:proofErr w:type="spellEnd"/>
-    </w:p>
-    <w:p>
-      <w:pPr>
-        <w:numPr>
-          <w:ilvl w:val="0"/>
-          <w:numId w:val="17"/>
-        </w:numPr>
-        <w:rPr>
-          <w:rFonts w:ascii="Segoe UI" w:eastAsia="Times New Roman" w:hAnsi="Segoe UI" w:cs="Segoe UI"/>
-          <w:b/>
-          <w:bCs/>
-          <w:color w:val="404040"/>
-          <w:kern w:val="0"/>
-          <w:sz w:val="27"/>
-          <w:szCs w:val="27"/>
-          <w:lang w:eastAsia="fr-FR"/>
-          <w14:ligatures w14:val="none"/>
-        </w:rPr>
-      </w:pPr>
-      <w:r>
-        <w:rPr>
-          <w:rFonts w:ascii="Segoe UI" w:eastAsia="Times New Roman" w:hAnsi="Segoe UI" w:cs="Segoe UI"/>
-          <w:b/>
-          <w:bCs/>
-          <w:color w:val="404040"/>
-          <w:kern w:val="0"/>
-          <w:sz w:val="27"/>
-          <w:szCs w:val="27"/>
-          <w:lang w:eastAsia="fr-FR"/>
-          <w14:ligatures w14:val="none"/>
-        </w:rPr>
-        <w:t xml:space="preserve">Sales </w:t>
-      </w:r>
-      <w:proofErr w:type="spellStart"/>
-      <w:r>
-        <w:rPr>
-          <w:rFonts w:ascii="Segoe UI" w:eastAsia="Times New Roman" w:hAnsi="Segoe UI" w:cs="Segoe UI"/>
-          <w:b/>
-          <w:bCs/>
-          <w:color w:val="404040"/>
-          <w:kern w:val="0"/>
-          <w:sz w:val="27"/>
-          <w:szCs w:val="27"/>
-          <w:lang w:eastAsia="fr-FR"/>
-          <w14:ligatures w14:val="none"/>
-        </w:rPr>
-        <w:t>Growth</w:t>
-      </w:r>
-      <w:proofErr w:type="spellEnd"/>
-      <w:r>
-        <w:rPr>
-          <w:rFonts w:ascii="Segoe UI" w:eastAsia="Times New Roman" w:hAnsi="Segoe UI" w:cs="Segoe UI"/>
-          <w:b/>
-          <w:bCs/>
-          <w:color w:val="404040"/>
-          <w:kern w:val="0"/>
-          <w:sz w:val="27"/>
-          <w:szCs w:val="27"/>
-          <w:lang w:eastAsia="fr-FR"/>
-          <w14:ligatures w14:val="none"/>
-        </w:rPr>
-        <w:t>: €318,978.1k.</w:t>
-      </w:r>
-    </w:p>
-    <w:p>
-      <w:pPr>
-        <w:numPr>
-          <w:ilvl w:val="0"/>
-          <w:numId w:val="17"/>
-        </w:numPr>
-        <w:rPr>
-          <w:rFonts w:ascii="Segoe UI" w:eastAsia="Times New Roman" w:hAnsi="Segoe UI" w:cs="Segoe UI"/>
-          <w:b/>
-          <w:bCs/>
-          <w:color w:val="404040"/>
-          <w:kern w:val="0"/>
-          <w:sz w:val="27"/>
-          <w:szCs w:val="27"/>
-          <w:lang w:eastAsia="fr-FR"/>
-          <w14:ligatures w14:val="none"/>
-        </w:rPr>
-      </w:pPr>
-      <w:proofErr w:type="spellStart"/>
-      <w:r>
-        <w:rPr>
-          <w:rFonts w:ascii="Segoe UI" w:eastAsia="Times New Roman" w:hAnsi="Segoe UI" w:cs="Segoe UI"/>
-          <w:b/>
-          <w:bCs/>
-          <w:color w:val="404040"/>
-          <w:kern w:val="0"/>
-          <w:sz w:val="27"/>
-          <w:szCs w:val="27"/>
-          <w:lang w:eastAsia="fr-FR"/>
-          <w14:ligatures w14:val="none"/>
-        </w:rPr>
-        <w:t>Cost</w:t>
-      </w:r>
-      <w:proofErr w:type="spellEnd"/>
-      <w:r>
-        <w:rPr>
-          <w:rFonts w:ascii="Segoe UI" w:eastAsia="Times New Roman" w:hAnsi="Segoe UI" w:cs="Segoe UI"/>
-          <w:b/>
-          <w:bCs/>
-          <w:color w:val="404040"/>
-          <w:kern w:val="0"/>
-          <w:sz w:val="27"/>
-          <w:szCs w:val="27"/>
-          <w:lang w:eastAsia="fr-FR"/>
-          <w14:ligatures w14:val="none"/>
-        </w:rPr>
-        <w:t xml:space="preserve"> Control: €91,108.3k.</w:t>
-      </w:r>
-    </w:p>
-    <w:p>
-      <w:pPr>
-        <w:numPr>
-          <w:ilvl w:val="0"/>
-          <w:numId w:val="17"/>
-        </w:numPr>
-        <w:rPr>
-          <w:rFonts w:ascii="Segoe UI" w:eastAsia="Times New Roman" w:hAnsi="Segoe UI" w:cs="Segoe UI"/>
-          <w:b/>
-          <w:bCs/>
-          <w:color w:val="404040"/>
-          <w:kern w:val="0"/>
-          <w:sz w:val="27"/>
-          <w:szCs w:val="27"/>
-          <w:lang w:eastAsia="fr-FR"/>
-          <w14:ligatures w14:val="none"/>
-        </w:rPr>
-      </w:pPr>
-      <w:r>
-        <w:rPr>
-          <w:rFonts w:ascii="Segoe UI" w:eastAsia="Times New Roman" w:hAnsi="Segoe UI" w:cs="Segoe UI"/>
-          <w:b/>
-          <w:bCs/>
-          <w:color w:val="404040"/>
-          <w:kern w:val="0"/>
-          <w:sz w:val="27"/>
-          <w:szCs w:val="27"/>
-          <w:lang w:eastAsia="fr-FR"/>
-          <w14:ligatures w14:val="none"/>
-        </w:rPr>
-        <w:t xml:space="preserve">Net </w:t>
-      </w:r>
-      <w:proofErr w:type="spellStart"/>
-      <w:r>
-        <w:rPr>
-          <w:rFonts w:ascii="Segoe UI" w:eastAsia="Times New Roman" w:hAnsi="Segoe UI" w:cs="Segoe UI"/>
-          <w:b/>
-          <w:bCs/>
-          <w:color w:val="404040"/>
-          <w:kern w:val="0"/>
-          <w:sz w:val="27"/>
-          <w:szCs w:val="27"/>
-          <w:lang w:eastAsia="fr-FR"/>
-          <w14:ligatures w14:val="none"/>
-        </w:rPr>
-        <w:t>Margin</w:t>
-      </w:r>
-      <w:proofErr w:type="spellEnd"/>
-      <w:r>
-        <w:rPr>
-          <w:rFonts w:ascii="Segoe UI" w:eastAsia="Times New Roman" w:hAnsi="Segoe UI" w:cs="Segoe UI"/>
-          <w:b/>
-          <w:bCs/>
-          <w:color w:val="404040"/>
-          <w:kern w:val="0"/>
-          <w:sz w:val="27"/>
-          <w:szCs w:val="27"/>
-          <w:lang w:eastAsia="fr-FR"/>
-          <w14:ligatures w14:val="none"/>
-        </w:rPr>
-        <w:t>: 72% (+1 point).</w:t>
-      </w:r>
-    </w:p>
-    <w:p>
-      <w:pPr>
-        <w:rPr>
-          <w:rFonts w:ascii="Segoe UI" w:eastAsia="Times New Roman" w:hAnsi="Segoe UI" w:cs="Segoe UI"/>
-          <w:b/>
-          <w:bCs/>
-          <w:color w:val="404040"/>
-          <w:kern w:val="0"/>
-          <w:sz w:val="27"/>
-          <w:szCs w:val="27"/>
-          <w:lang w:eastAsia="fr-FR"/>
-          <w14:ligatures w14:val="none"/>
-        </w:rPr>
-      </w:pPr>
-      <w:proofErr w:type="spellStart"/>
-      <w:r>
-        <w:rPr>
-          <w:rFonts w:ascii="Segoe UI" w:eastAsia="Times New Roman" w:hAnsi="Segoe UI" w:cs="Segoe UI"/>
-          <w:b/>
-          <w:bCs/>
-          <w:color w:val="404040"/>
-          <w:kern w:val="0"/>
-          <w:sz w:val="27"/>
-          <w:szCs w:val="27"/>
-          <w:lang w:eastAsia="fr-FR"/>
-          <w14:ligatures w14:val="none"/>
-        </w:rPr>
-        <w:t>Operational</w:t>
-      </w:r>
-      <w:proofErr w:type="spellEnd"/>
-      <w:r>
-        <w:rPr>
-          <w:rFonts w:ascii="Segoe UI" w:eastAsia="Times New Roman" w:hAnsi="Segoe UI" w:cs="Segoe UI"/>
-          <w:b/>
-          <w:bCs/>
-          <w:color w:val="404040"/>
-          <w:kern w:val="0"/>
-          <w:sz w:val="27"/>
-          <w:szCs w:val="27"/>
-          <w:lang w:eastAsia="fr-FR"/>
-          <w14:ligatures w14:val="none"/>
-        </w:rPr>
-        <w:t xml:space="preserve"> </w:t>
-      </w:r>
-      <w:proofErr w:type="spellStart"/>
-      <w:r>
-        <w:rPr>
-          <w:rFonts w:ascii="Segoe UI" w:eastAsia="Times New Roman" w:hAnsi="Segoe UI" w:cs="Segoe UI"/>
-          <w:b/>
-          <w:bCs/>
-          <w:color w:val="404040"/>
-          <w:kern w:val="0"/>
-          <w:sz w:val="27"/>
-          <w:szCs w:val="27"/>
-          <w:lang w:eastAsia="fr-FR"/>
-          <w14:ligatures w14:val="none"/>
-        </w:rPr>
-        <w:t>Recommendations</w:t>
-      </w:r>
-      <w:proofErr w:type="spellEnd"/>
-    </w:p>
-    <w:p>
-      <w:pPr>
-        <w:numPr>
-          <w:ilvl w:val="0"/>
-          <w:numId w:val="18"/>
-        </w:numPr>
-        <w:rPr>
-          <w:rFonts w:ascii="Segoe UI" w:eastAsia="Times New Roman" w:hAnsi="Segoe UI" w:cs="Segoe UI"/>
-          <w:b/>
-          <w:bCs/>
-          <w:color w:val="404040"/>
-          <w:kern w:val="0"/>
-          <w:sz w:val="27"/>
-          <w:szCs w:val="27"/>
-          <w:lang w:eastAsia="fr-FR"/>
-          <w14:ligatures w14:val="none"/>
-        </w:rPr>
-      </w:pPr>
-      <w:r>
-        <w:rPr>
-          <w:rFonts w:ascii="Segoe UI" w:eastAsia="Times New Roman" w:hAnsi="Segoe UI" w:cs="Segoe UI"/>
-          <w:b/>
-          <w:bCs/>
-          <w:color w:val="404040"/>
-          <w:kern w:val="0"/>
-          <w:sz w:val="27"/>
-          <w:szCs w:val="27"/>
-          <w:lang w:val="en-US" w:eastAsia="fr-FR"/>
-          <w14:ligatures w14:val="none"/>
-        </w:rPr>
-        <w:t>AI-Driven Route Optimization rollout in Q1 (Jan-Mar).</w:t>
-      </w:r>
-      <w:r>
-        <w:rPr>
-          <w:rFonts w:ascii="Segoe UI" w:eastAsia="Times New Roman" w:hAnsi="Segoe UI" w:cs="Segoe UI"/>
-          <w:b/>
-          <w:bCs/>
-          <w:color w:val="404040"/>
-          <w:kern w:val="0"/>
-          <w:sz w:val="27"/>
-          <w:szCs w:val="27"/>
-          <w:lang w:val="en-US" w:eastAsia="fr-FR"/>
-          <w14:ligatures w14:val="none"/>
-        </w:rPr>
-        <w:br/>
-      </w:r>
-      <w:r>
-        <w:rPr>
-          <w:rFonts w:ascii="Segoe UI" w:eastAsia="Times New Roman" w:hAnsi="Segoe UI" w:cs="Segoe UI"/>
-          <w:b/>
-          <w:bCs/>
-          <w:i/>
-          <w:iCs/>
-          <w:color w:val="404040"/>
-          <w:kern w:val="0"/>
-          <w:sz w:val="27"/>
-          <w:szCs w:val="27"/>
-          <w:lang w:eastAsia="fr-FR"/>
-          <w14:ligatures w14:val="none"/>
-        </w:rPr>
-        <w:t>Key Indicator</w:t>
-      </w:r>
-      <w:r>
-        <w:rPr>
-          <w:rFonts w:ascii="Segoe UI" w:eastAsia="Times New Roman" w:hAnsi="Segoe UI" w:cs="Segoe UI"/>
-          <w:b/>
-          <w:bCs/>
-          <w:color w:val="404040"/>
-          <w:kern w:val="0"/>
-          <w:sz w:val="27"/>
-          <w:szCs w:val="27"/>
-          <w:lang w:eastAsia="fr-FR"/>
-          <w14:ligatures w14:val="none"/>
-        </w:rPr>
-        <w:t xml:space="preserve">: General </w:t>
-      </w:r>
-      <w:proofErr w:type="spellStart"/>
-      <w:r>
-        <w:rPr>
-          <w:rFonts w:ascii="Segoe UI" w:eastAsia="Times New Roman" w:hAnsi="Segoe UI" w:cs="Segoe UI"/>
-          <w:b/>
-          <w:bCs/>
-          <w:color w:val="404040"/>
-          <w:kern w:val="0"/>
-          <w:sz w:val="27"/>
-          <w:szCs w:val="27"/>
-          <w:lang w:eastAsia="fr-FR"/>
-          <w14:ligatures w14:val="none"/>
+          <w:rStyle w:val="lev"/>
+          <w:rFonts w:ascii="Segoe UI" w:eastAsiaTheme="majorEastAsia" w:hAnsi="Segoe UI" w:cs="Segoe UI"/>
+          <w:color w:val="404040"/>
         </w:rPr>
         <w:t>Costs</w:t>
       </w:r>
       <w:proofErr w:type="spellEnd"/>
       <w:r>
         <w:rPr>
-          <w:rFonts w:ascii="Segoe UI" w:eastAsia="Times New Roman" w:hAnsi="Segoe UI" w:cs="Segoe UI"/>
-          <w:b/>
-          <w:bCs/>
-          <w:color w:val="404040"/>
-          <w:kern w:val="0"/>
-          <w:sz w:val="27"/>
-          <w:szCs w:val="27"/>
-          <w:lang w:eastAsia="fr-FR"/>
-          <w14:ligatures w14:val="none"/>
-        </w:rPr>
-        <w:t> (-2%).</w:t>
+          <w:rFonts w:ascii="Segoe UI" w:hAnsi="Segoe UI" w:cs="Segoe UI"/>
+          <w:color w:val="404040"/>
+        </w:rPr>
+        <w:t>:</w:t>
       </w:r>
     </w:p>
     <w:p>
       <w:pPr>
+        <w:pStyle w:val="NormalWeb"/>
+        <w:numPr>
+          <w:ilvl w:val="1"/>
+          <w:numId w:val="19"/>
+        </w:numPr>
+        <w:spacing w:before="0" w:beforeAutospacing="0" w:after="0" w:afterAutospacing="0"/>
+        <w:rPr>
+          <w:rFonts w:ascii="Segoe UI" w:hAnsi="Segoe UI" w:cs="Segoe UI"/>
+          <w:color w:val="404040"/>
+          <w:lang w:val="en-US"/>
+        </w:rPr>
+      </w:pPr>
+      <w:r>
+        <w:rPr>
+          <w:rStyle w:val="lev"/>
+          <w:rFonts w:ascii="Segoe UI" w:eastAsiaTheme="majorEastAsia" w:hAnsi="Segoe UI" w:cs="Segoe UI"/>
+          <w:color w:val="404040"/>
+          <w:lang w:val="en-US"/>
+        </w:rPr>
+        <w:t>Biofuel Costs</w:t>
+      </w:r>
+      <w:r>
+        <w:rPr>
+          <w:rFonts w:ascii="Segoe UI" w:hAnsi="Segoe UI" w:cs="Segoe UI"/>
+          <w:color w:val="404040"/>
+          <w:lang w:val="en-US"/>
+        </w:rPr>
+        <w:t>:</w:t>
+      </w:r>
+    </w:p>
+    <w:p>
+      <w:pPr>
+        <w:pStyle w:val="NormalWeb"/>
+        <w:spacing w:before="0" w:beforeAutospacing="0" w:after="0" w:afterAutospacing="0"/>
+        <w:ind w:left="1440"/>
+        <w:rPr>
+          <w:rFonts w:ascii="Segoe UI" w:hAnsi="Segoe UI" w:cs="Segoe UI"/>
+          <w:color w:val="404040"/>
+          <w:lang w:val="en-US"/>
+        </w:rPr>
+      </w:pPr>
+      <w:r>
+        <w:rPr>
+          <w:rStyle w:val="lev"/>
+          <w:rFonts w:ascii="Segoe UI" w:eastAsiaTheme="majorEastAsia" w:hAnsi="Segoe UI" w:cs="Segoe UI"/>
+          <w:color w:val="404040"/>
+          <w:lang w:val="en-US"/>
+        </w:rPr>
+        <w:t>Target</w:t>
+      </w:r>
+      <w:r>
+        <w:rPr>
+          <w:rStyle w:val="lev"/>
+          <w:rFonts w:ascii="Segoe UI" w:eastAsiaTheme="majorEastAsia" w:hAnsi="Segoe UI" w:cs="Segoe UI"/>
+          <w:color w:val="404040"/>
+          <w:lang w:val="en-US"/>
+        </w:rPr>
+        <w:t xml:space="preserve"> 2025</w:t>
+      </w:r>
+      <w:r>
+        <w:rPr>
+          <w:rFonts w:ascii="Segoe UI" w:hAnsi="Segoe UI" w:cs="Segoe UI"/>
+          <w:color w:val="404040"/>
+          <w:lang w:val="en-US"/>
+        </w:rPr>
+        <w:t>: €9,30</w:t>
+      </w:r>
+      <w:r>
+        <w:rPr>
+          <w:rFonts w:ascii="Segoe UI" w:hAnsi="Segoe UI" w:cs="Segoe UI"/>
+          <w:color w:val="404040"/>
+          <w:lang w:val="en-US"/>
+        </w:rPr>
+        <w:t>0</w:t>
+      </w:r>
+      <w:r>
+        <w:rPr>
+          <w:rFonts w:ascii="Segoe UI" w:hAnsi="Segoe UI" w:cs="Segoe UI"/>
+          <w:color w:val="404040"/>
+          <w:lang w:val="en-US"/>
+        </w:rPr>
+        <w:t>k using sustainable aviation fuel trials.</w:t>
+      </w:r>
+    </w:p>
+    <w:p>
+      <w:pPr>
+        <w:pStyle w:val="Titre4"/>
+        <w:rPr>
+          <w:rFonts w:ascii="Segoe UI" w:hAnsi="Segoe UI" w:cs="Segoe UI"/>
+          <w:color w:val="404040"/>
+        </w:rPr>
+      </w:pPr>
+      <w:r>
+        <w:rPr>
+          <w:rStyle w:val="lev"/>
+          <w:rFonts w:ascii="Segoe UI" w:hAnsi="Segoe UI" w:cs="Segoe UI"/>
+          <w:b w:val="0"/>
+          <w:bCs w:val="0"/>
+          <w:color w:val="404040"/>
+        </w:rPr>
+        <w:t>Ireland</w:t>
+      </w:r>
+    </w:p>
+    <w:p>
+      <w:pPr>
+        <w:pStyle w:val="NormalWeb"/>
         <w:numPr>
           <w:ilvl w:val="0"/>
-          <w:numId w:val="18"/>
+          <w:numId w:val="20"/>
         </w:numPr>
-        <w:rPr>
-          <w:rFonts w:ascii="Segoe UI" w:eastAsia="Times New Roman" w:hAnsi="Segoe UI" w:cs="Segoe UI"/>
-          <w:b/>
-          <w:bCs/>
-          <w:color w:val="404040"/>
-          <w:kern w:val="0"/>
-          <w:sz w:val="27"/>
-          <w:szCs w:val="27"/>
-          <w:lang w:val="en-US" w:eastAsia="fr-FR"/>
-          <w14:ligatures w14:val="none"/>
+        <w:spacing w:before="0" w:beforeAutospacing="0" w:after="60" w:afterAutospacing="0"/>
+        <w:rPr>
+          <w:rFonts w:ascii="Segoe UI" w:hAnsi="Segoe UI" w:cs="Segoe UI"/>
+          <w:color w:val="404040"/>
         </w:rPr>
       </w:pPr>
       <w:r>
         <w:rPr>
-          <w:rFonts w:ascii="Segoe UI" w:eastAsia="Times New Roman" w:hAnsi="Segoe UI" w:cs="Segoe UI"/>
-          <w:b/>
-          <w:bCs/>
-          <w:color w:val="404040"/>
-          <w:kern w:val="0"/>
-          <w:sz w:val="27"/>
-          <w:szCs w:val="27"/>
-          <w:lang w:val="en-US" w:eastAsia="fr-FR"/>
-          <w14:ligatures w14:val="none"/>
-        </w:rPr>
-        <w:t>Business Mobility Pass launch in March for corporate clients.</w:t>
+          <w:rStyle w:val="lev"/>
+          <w:rFonts w:ascii="Segoe UI" w:eastAsiaTheme="majorEastAsia" w:hAnsi="Segoe UI" w:cs="Segoe UI"/>
+          <w:color w:val="404040"/>
+        </w:rPr>
+        <w:t>Sales/Revenues</w:t>
       </w:r>
       <w:r>
         <w:rPr>
-          <w:rFonts w:ascii="Segoe UI" w:eastAsia="Times New Roman" w:hAnsi="Segoe UI" w:cs="Segoe UI"/>
-          <w:b/>
-          <w:bCs/>
-          <w:color w:val="404040"/>
-          <w:kern w:val="0"/>
-          <w:sz w:val="27"/>
-          <w:szCs w:val="27"/>
-          <w:lang w:val="en-US" w:eastAsia="fr-FR"/>
-          <w14:ligatures w14:val="none"/>
-        </w:rPr>
-        <w:br/>
+          <w:rFonts w:ascii="Segoe UI" w:hAnsi="Segoe UI" w:cs="Segoe UI"/>
+          <w:color w:val="404040"/>
+        </w:rPr>
+        <w:t>:</w:t>
+      </w:r>
+    </w:p>
+    <w:p>
+      <w:pPr>
+        <w:pStyle w:val="NormalWeb"/>
+        <w:numPr>
+          <w:ilvl w:val="1"/>
+          <w:numId w:val="20"/>
+        </w:numPr>
+        <w:spacing w:before="0" w:beforeAutospacing="0" w:after="0" w:afterAutospacing="0"/>
+        <w:rPr>
+          <w:rFonts w:ascii="Segoe UI" w:hAnsi="Segoe UI" w:cs="Segoe UI"/>
+          <w:color w:val="404040"/>
+          <w:lang w:val="en-US"/>
+        </w:rPr>
+      </w:pPr>
+      <w:r>
+        <w:rPr>
+          <w:rStyle w:val="lev"/>
+          <w:rFonts w:ascii="Segoe UI" w:eastAsiaTheme="majorEastAsia" w:hAnsi="Segoe UI" w:cs="Segoe UI"/>
+          <w:color w:val="404040"/>
+          <w:lang w:val="en-US"/>
+        </w:rPr>
+        <w:t>Fuel Sales</w:t>
       </w:r>
       <w:r>
         <w:rPr>
-          <w:rFonts w:ascii="Segoe UI" w:eastAsia="Times New Roman" w:hAnsi="Segoe UI" w:cs="Segoe UI"/>
-          <w:b/>
-          <w:bCs/>
-          <w:i/>
-          <w:iCs/>
-          <w:color w:val="404040"/>
-          <w:kern w:val="0"/>
-          <w:sz w:val="27"/>
-          <w:szCs w:val="27"/>
-          <w:lang w:val="en-US" w:eastAsia="fr-FR"/>
-          <w14:ligatures w14:val="none"/>
-        </w:rPr>
-        <w:t>Key Indicator</w:t>
+          <w:rFonts w:ascii="Segoe UI" w:hAnsi="Segoe UI" w:cs="Segoe UI"/>
+          <w:color w:val="404040"/>
+          <w:lang w:val="en-US"/>
+        </w:rPr>
+        <w:t xml:space="preserve">: </w:t>
+      </w:r>
+    </w:p>
+    <w:p>
+      <w:pPr>
+        <w:pStyle w:val="NormalWeb"/>
+        <w:spacing w:before="0" w:beforeAutospacing="0" w:after="0" w:afterAutospacing="0"/>
+        <w:ind w:left="1440"/>
+        <w:rPr>
+          <w:rFonts w:ascii="Segoe UI" w:hAnsi="Segoe UI" w:cs="Segoe UI"/>
+          <w:color w:val="404040"/>
+          <w:lang w:val="en-US"/>
+        </w:rPr>
+      </w:pPr>
+      <w:r>
+        <w:rPr>
+          <w:rStyle w:val="lev"/>
+          <w:rFonts w:ascii="Segoe UI" w:eastAsiaTheme="majorEastAsia" w:hAnsi="Segoe UI" w:cs="Segoe UI"/>
+          <w:color w:val="404040"/>
+          <w:lang w:val="en-US"/>
+        </w:rPr>
+        <w:t>Target</w:t>
       </w:r>
       <w:r>
         <w:rPr>
-          <w:rFonts w:ascii="Segoe UI" w:eastAsia="Times New Roman" w:hAnsi="Segoe UI" w:cs="Segoe UI"/>
-          <w:b/>
-          <w:bCs/>
-          <w:color w:val="404040"/>
-          <w:kern w:val="0"/>
-          <w:sz w:val="27"/>
-          <w:szCs w:val="27"/>
-          <w:lang w:val="en-US" w:eastAsia="fr-FR"/>
-          <w14:ligatures w14:val="none"/>
-        </w:rPr>
-        <w:t>: Commercial Revenues - Contractual Commitment (+5%).</w:t>
+          <w:rStyle w:val="lev"/>
+          <w:rFonts w:ascii="Segoe UI" w:eastAsiaTheme="majorEastAsia" w:hAnsi="Segoe UI" w:cs="Segoe UI"/>
+          <w:color w:val="404040"/>
+          <w:lang w:val="en-US"/>
+        </w:rPr>
+        <w:t xml:space="preserve"> 2025</w:t>
+      </w:r>
+      <w:r>
+        <w:rPr>
+          <w:rFonts w:ascii="Segoe UI" w:hAnsi="Segoe UI" w:cs="Segoe UI"/>
+          <w:color w:val="404040"/>
+          <w:lang w:val="en-US"/>
+        </w:rPr>
+        <w:t>: €12,0</w:t>
+      </w:r>
+      <w:r>
+        <w:rPr>
+          <w:rFonts w:ascii="Segoe UI" w:hAnsi="Segoe UI" w:cs="Segoe UI"/>
+          <w:color w:val="404040"/>
+          <w:lang w:val="en-US"/>
+        </w:rPr>
+        <w:t>00</w:t>
+      </w:r>
+      <w:r>
+        <w:rPr>
+          <w:rFonts w:ascii="Segoe UI" w:hAnsi="Segoe UI" w:cs="Segoe UI"/>
+          <w:color w:val="404040"/>
+          <w:lang w:val="en-US"/>
+        </w:rPr>
+        <w:t>k with rural station expansions.</w:t>
+      </w:r>
+    </w:p>
+    <w:p>
+      <w:pPr>
+        <w:pStyle w:val="NormalWeb"/>
+        <w:numPr>
+          <w:ilvl w:val="0"/>
+          <w:numId w:val="20"/>
+        </w:numPr>
+        <w:spacing w:before="0" w:beforeAutospacing="0" w:after="60" w:afterAutospacing="0"/>
+        <w:rPr>
+          <w:rFonts w:ascii="Segoe UI" w:hAnsi="Segoe UI" w:cs="Segoe UI"/>
+          <w:color w:val="404040"/>
+        </w:rPr>
+      </w:pPr>
+      <w:proofErr w:type="spellStart"/>
+      <w:r>
+        <w:rPr>
+          <w:rStyle w:val="lev"/>
+          <w:rFonts w:ascii="Segoe UI" w:eastAsiaTheme="majorEastAsia" w:hAnsi="Segoe UI" w:cs="Segoe UI"/>
+          <w:color w:val="404040"/>
+        </w:rPr>
+        <w:t>Costs</w:t>
+      </w:r>
+      <w:proofErr w:type="spellEnd"/>
+      <w:r>
+        <w:rPr>
+          <w:rFonts w:ascii="Segoe UI" w:hAnsi="Segoe UI" w:cs="Segoe UI"/>
+          <w:color w:val="404040"/>
+        </w:rPr>
+        <w:t>:</w:t>
+      </w:r>
+    </w:p>
+    <w:p>
+      <w:pPr>
+        <w:pStyle w:val="NormalWeb"/>
+        <w:numPr>
+          <w:ilvl w:val="1"/>
+          <w:numId w:val="20"/>
+        </w:numPr>
+        <w:spacing w:before="0" w:beforeAutospacing="0" w:after="0" w:afterAutospacing="0"/>
+        <w:rPr>
+          <w:rFonts w:ascii="Segoe UI" w:hAnsi="Segoe UI" w:cs="Segoe UI"/>
+          <w:color w:val="404040"/>
+          <w:lang w:val="en-US"/>
+        </w:rPr>
+      </w:pPr>
+      <w:r>
+        <w:rPr>
+          <w:rStyle w:val="lev"/>
+          <w:rFonts w:ascii="Segoe UI" w:eastAsiaTheme="majorEastAsia" w:hAnsi="Segoe UI" w:cs="Segoe UI"/>
+          <w:color w:val="404040"/>
+          <w:lang w:val="en-US"/>
+        </w:rPr>
+        <w:t>Travel Expenses (SO)</w:t>
+      </w:r>
+      <w:r>
+        <w:rPr>
+          <w:rFonts w:ascii="Segoe UI" w:hAnsi="Segoe UI" w:cs="Segoe UI"/>
+          <w:color w:val="404040"/>
+          <w:lang w:val="en-US"/>
+        </w:rPr>
+        <w:t>:</w:t>
+      </w:r>
+    </w:p>
+    <w:p>
+      <w:pPr>
+        <w:pStyle w:val="NormalWeb"/>
+        <w:spacing w:before="0" w:beforeAutospacing="0" w:after="0" w:afterAutospacing="0"/>
+        <w:ind w:left="1440"/>
+        <w:rPr>
+          <w:rFonts w:ascii="Segoe UI" w:hAnsi="Segoe UI" w:cs="Segoe UI"/>
+          <w:color w:val="404040"/>
+          <w:lang w:val="en-US"/>
+        </w:rPr>
+      </w:pPr>
+      <w:r>
+        <w:rPr>
+          <w:rStyle w:val="lev"/>
+          <w:rFonts w:ascii="Segoe UI" w:eastAsiaTheme="majorEastAsia" w:hAnsi="Segoe UI" w:cs="Segoe UI"/>
+          <w:color w:val="404040"/>
+          <w:lang w:val="en-US"/>
+        </w:rPr>
+        <w:t>Target</w:t>
+      </w:r>
+      <w:r>
+        <w:rPr>
+          <w:rStyle w:val="lev"/>
+          <w:rFonts w:ascii="Segoe UI" w:eastAsiaTheme="majorEastAsia" w:hAnsi="Segoe UI" w:cs="Segoe UI"/>
+          <w:color w:val="404040"/>
+          <w:lang w:val="en-US"/>
+        </w:rPr>
+        <w:t xml:space="preserve"> 2025</w:t>
+      </w:r>
+      <w:r>
+        <w:rPr>
+          <w:rFonts w:ascii="Segoe UI" w:hAnsi="Segoe UI" w:cs="Segoe UI"/>
+          <w:color w:val="404040"/>
+          <w:lang w:val="en-US"/>
+        </w:rPr>
+        <w:t>: €3,</w:t>
+      </w:r>
+      <w:r>
+        <w:rPr>
+          <w:rFonts w:ascii="Segoe UI" w:hAnsi="Segoe UI" w:cs="Segoe UI"/>
+          <w:color w:val="404040"/>
+          <w:lang w:val="en-US"/>
+        </w:rPr>
+        <w:t>500</w:t>
+      </w:r>
+      <w:r>
+        <w:rPr>
+          <w:rFonts w:ascii="Segoe UI" w:hAnsi="Segoe UI" w:cs="Segoe UI"/>
+          <w:color w:val="404040"/>
+          <w:lang w:val="en-US"/>
+        </w:rPr>
+        <w:t>k via virtual conferencing adoption.</w:t>
       </w:r>
     </w:p>
     <w:p>
@@ -1181,6 +1016,155 @@
     </w:lvl>
   </w:abstractNum>
   <w:abstractNum w:abstractNumId="3" w15:restartNumberingAfterBreak="0">
+    <w:nsid w:val="1A0D07C9"/>
+    <w:multiLevelType w:val="multilevel"/>
+    <w:tmpl w:val="D46816E8"/>
+    <w:lvl w:ilvl="0">
+      <w:start w:val="1"/>
+      <w:numFmt w:val="bullet"/>
+      <w:lvlText w:val=""/>
+      <w:lvlJc w:val="left"/>
+      <w:pPr>
+        <w:tabs>
+          <w:tab w:val="num" w:pos="720"/>
+        </w:tabs>
+        <w:ind w:left="720" w:hanging="360"/>
+      </w:pPr>
+      <w:rPr>
+        <w:rFonts w:ascii="Symbol" w:hAnsi="Symbol" w:hint="default"/>
+        <w:sz w:val="20"/>
+      </w:rPr>
+    </w:lvl>
+    <w:lvl w:ilvl="1">
+      <w:start w:val="1"/>
+      <w:numFmt w:val="bullet"/>
+      <w:lvlText w:val="o"/>
+      <w:lvlJc w:val="left"/>
+      <w:pPr>
+        <w:tabs>
+          <w:tab w:val="num" w:pos="1440"/>
+        </w:tabs>
+        <w:ind w:left="1440" w:hanging="360"/>
+      </w:pPr>
+      <w:rPr>
+        <w:rFonts w:ascii="Courier New" w:hAnsi="Courier New" w:hint="default"/>
+        <w:sz w:val="20"/>
+      </w:rPr>
+    </w:lvl>
+    <w:lvl w:ilvl="2" w:tentative="1">
+      <w:start w:val="1"/>
+      <w:numFmt w:val="bullet"/>
+      <w:lvlText w:val=""/>
+      <w:lvlJc w:val="left"/>
+      <w:pPr>
+        <w:tabs>
+          <w:tab w:val="num" w:pos="2160"/>
+        </w:tabs>
+        <w:ind w:left="2160" w:hanging="360"/>
+      </w:pPr>
+      <w:rPr>
+        <w:rFonts w:ascii="Wingdings" w:hAnsi="Wingdings" w:hint="default"/>
+        <w:sz w:val="20"/>
+      </w:rPr>
+    </w:lvl>
+    <w:lvl w:ilvl="3" w:tentative="1">
+      <w:start w:val="1"/>
+      <w:numFmt w:val="bullet"/>
+      <w:lvlText w:val=""/>
+      <w:lvlJc w:val="left"/>
+      <w:pPr>
+        <w:tabs>
+          <w:tab w:val="num" w:pos="2880"/>
+        </w:tabs>
+        <w:ind w:left="2880" w:hanging="360"/>
+      </w:pPr>
+      <w:rPr>
+        <w:rFonts w:ascii="Wingdings" w:hAnsi="Wingdings" w:hint="default"/>
+        <w:sz w:val="20"/>
+      </w:rPr>
+    </w:lvl>
+    <w:lvl w:ilvl="4" w:tentative="1">
+      <w:start w:val="1"/>
+      <w:numFmt w:val="bullet"/>
+      <w:lvlText w:val=""/>
+      <w:lvlJc w:val="left"/>
+      <w:pPr>
+        <w:tabs>
+          <w:tab w:val="num" w:pos="3600"/>
+        </w:tabs>
+        <w:ind w:left="3600" w:hanging="360"/>
+      </w:pPr>
+      <w:rPr>
+        <w:rFonts w:ascii="Wingdings" w:hAnsi="Wingdings" w:hint="default"/>
+        <w:sz w:val="20"/>
+      </w:rPr>
+    </w:lvl>
+    <w:lvl w:ilvl="5" w:tentative="1">
+      <w:start w:val="1"/>
+      <w:numFmt w:val="bullet"/>
+      <w:lvlText w:val=""/>
+      <w:lvlJc w:val="left"/>
+      <w:pPr>
+        <w:tabs>
+          <w:tab w:val="num" w:pos="4320"/>
+        </w:tabs>
+        <w:ind w:left="4320" w:hanging="360"/>
+      </w:pPr>
+      <w:rPr>
+        <w:rFonts w:ascii="Wingdings" w:hAnsi="Wingdings" w:hint="default"/>
+        <w:sz w:val="20"/>
+      </w:rPr>
+    </w:lvl>
+    <w:lvl w:ilvl="6" w:tentative="1">
+      <w:start w:val="1"/>
+      <w:numFmt w:val="bullet"/>
+      <w:lvlText w:val=""/>
+      <w:lvlJc w:val="left"/>
+      <w:pPr>
+        <w:tabs>
+          <w:tab w:val="num" w:pos="5040"/>
+        </w:tabs>
+        <w:ind w:left="5040" w:hanging="360"/>
+      </w:pPr>
+      <w:rPr>
+        <w:rFonts w:ascii="Wingdings" w:hAnsi="Wingdings" w:hint="default"/>
+        <w:sz w:val="20"/>
+      </w:rPr>
+    </w:lvl>
+    <w:lvl w:ilvl="7" w:tentative="1">
+      <w:start w:val="1"/>
+      <w:numFmt w:val="bullet"/>
+      <w:lvlText w:val=""/>
+      <w:lvlJc w:val="left"/>
+      <w:pPr>
+        <w:tabs>
+          <w:tab w:val="num" w:pos="5760"/>
+        </w:tabs>
+        <w:ind w:left="5760" w:hanging="360"/>
+      </w:pPr>
+      <w:rPr>
+        <w:rFonts w:ascii="Wingdings" w:hAnsi="Wingdings" w:hint="default"/>
+        <w:sz w:val="20"/>
+      </w:rPr>
+    </w:lvl>
+    <w:lvl w:ilvl="8" w:tentative="1">
+      <w:start w:val="1"/>
+      <w:numFmt w:val="bullet"/>
+      <w:lvlText w:val=""/>
+      <w:lvlJc w:val="left"/>
+      <w:pPr>
+        <w:tabs>
+          <w:tab w:val="num" w:pos="6480"/>
+        </w:tabs>
+        <w:ind w:left="6480" w:hanging="360"/>
+      </w:pPr>
+      <w:rPr>
+        <w:rFonts w:ascii="Wingdings" w:hAnsi="Wingdings" w:hint="default"/>
+        <w:sz w:val="20"/>
+      </w:rPr>
+    </w:lvl>
+  </w:abstractNum>
+  <w:abstractNum w:abstractNumId="4" w15:restartNumberingAfterBreak="0">
     <w:nsid w:val="29525BF4"/>
     <w:multiLevelType w:val="multilevel"/>
     <w:tmpl w:val="CA92E318"/>
@@ -1329,7 +1313,7 @@
       </w:rPr>
     </w:lvl>
   </w:abstractNum>
-  <w:abstractNum w:abstractNumId="4" w15:restartNumberingAfterBreak="0">
+  <w:abstractNum w:abstractNumId="5" w15:restartNumberingAfterBreak="0">
     <w:nsid w:val="314A1F76"/>
     <w:multiLevelType w:val="multilevel"/>
     <w:tmpl w:val="511632C0"/>
@@ -1478,7 +1462,7 @@
       </w:rPr>
     </w:lvl>
   </w:abstractNum>
-  <w:abstractNum w:abstractNumId="5" w15:restartNumberingAfterBreak="0">
+  <w:abstractNum w:abstractNumId="6" w15:restartNumberingAfterBreak="0">
     <w:nsid w:val="33F86AF2"/>
     <w:multiLevelType w:val="multilevel"/>
     <w:tmpl w:val="2A929F02"/>
@@ -1627,7 +1611,7 @@
       </w:rPr>
     </w:lvl>
   </w:abstractNum>
-  <w:abstractNum w:abstractNumId="6" w15:restartNumberingAfterBreak="0">
+  <w:abstractNum w:abstractNumId="7" w15:restartNumberingAfterBreak="0">
     <w:nsid w:val="35F067E8"/>
     <w:multiLevelType w:val="multilevel"/>
     <w:tmpl w:val="FB1036EC"/>
@@ -1776,7 +1760,7 @@
       </w:rPr>
     </w:lvl>
   </w:abstractNum>
-  <w:abstractNum w:abstractNumId="7" w15:restartNumberingAfterBreak="0">
+  <w:abstractNum w:abstractNumId="8" w15:restartNumberingAfterBreak="0">
     <w:nsid w:val="41785269"/>
     <w:multiLevelType w:val="multilevel"/>
     <w:tmpl w:val="799236E6"/>
@@ -1925,7 +1909,7 @@
       </w:rPr>
     </w:lvl>
   </w:abstractNum>
-  <w:abstractNum w:abstractNumId="8" w15:restartNumberingAfterBreak="0">
+  <w:abstractNum w:abstractNumId="9" w15:restartNumberingAfterBreak="0">
     <w:nsid w:val="4BE41BC4"/>
     <w:multiLevelType w:val="multilevel"/>
     <w:tmpl w:val="AF90BB96"/>
@@ -2074,7 +2058,7 @@
       </w:rPr>
     </w:lvl>
   </w:abstractNum>
-  <w:abstractNum w:abstractNumId="9" w15:restartNumberingAfterBreak="0">
+  <w:abstractNum w:abstractNumId="10" w15:restartNumberingAfterBreak="0">
     <w:nsid w:val="50341159"/>
     <w:multiLevelType w:val="multilevel"/>
     <w:tmpl w:val="685C2196"/>
@@ -2187,7 +2171,7 @@
       </w:pPr>
     </w:lvl>
   </w:abstractNum>
-  <w:abstractNum w:abstractNumId="10" w15:restartNumberingAfterBreak="0">
+  <w:abstractNum w:abstractNumId="11" w15:restartNumberingAfterBreak="0">
     <w:nsid w:val="533A1897"/>
     <w:multiLevelType w:val="multilevel"/>
     <w:tmpl w:val="3B882B84"/>
@@ -2336,7 +2320,7 @@
       </w:rPr>
     </w:lvl>
   </w:abstractNum>
-  <w:abstractNum w:abstractNumId="11" w15:restartNumberingAfterBreak="0">
+  <w:abstractNum w:abstractNumId="12" w15:restartNumberingAfterBreak="0">
     <w:nsid w:val="57F52847"/>
     <w:multiLevelType w:val="multilevel"/>
     <w:tmpl w:val="E126EB80"/>
@@ -2485,7 +2469,7 @@
       </w:rPr>
     </w:lvl>
   </w:abstractNum>
-  <w:abstractNum w:abstractNumId="12" w15:restartNumberingAfterBreak="0">
+  <w:abstractNum w:abstractNumId="13" w15:restartNumberingAfterBreak="0">
     <w:nsid w:val="5ADC03A5"/>
     <w:multiLevelType w:val="multilevel"/>
     <w:tmpl w:val="ED2A185E"/>
@@ -2634,7 +2618,156 @@
       </w:rPr>
     </w:lvl>
   </w:abstractNum>
-  <w:abstractNum w:abstractNumId="13" w15:restartNumberingAfterBreak="0">
+  <w:abstractNum w:abstractNumId="14" w15:restartNumberingAfterBreak="0">
+    <w:nsid w:val="5F02202C"/>
+    <w:multiLevelType w:val="multilevel"/>
+    <w:tmpl w:val="0416FF22"/>
+    <w:lvl w:ilvl="0">
+      <w:start w:val="1"/>
+      <w:numFmt w:val="bullet"/>
+      <w:lvlText w:val=""/>
+      <w:lvlJc w:val="left"/>
+      <w:pPr>
+        <w:tabs>
+          <w:tab w:val="num" w:pos="720"/>
+        </w:tabs>
+        <w:ind w:left="720" w:hanging="360"/>
+      </w:pPr>
+      <w:rPr>
+        <w:rFonts w:ascii="Symbol" w:hAnsi="Symbol" w:hint="default"/>
+        <w:sz w:val="20"/>
+      </w:rPr>
+    </w:lvl>
+    <w:lvl w:ilvl="1">
+      <w:start w:val="1"/>
+      <w:numFmt w:val="bullet"/>
+      <w:lvlText w:val="o"/>
+      <w:lvlJc w:val="left"/>
+      <w:pPr>
+        <w:tabs>
+          <w:tab w:val="num" w:pos="1440"/>
+        </w:tabs>
+        <w:ind w:left="1440" w:hanging="360"/>
+      </w:pPr>
+      <w:rPr>
+        <w:rFonts w:ascii="Courier New" w:hAnsi="Courier New" w:hint="default"/>
+        <w:sz w:val="20"/>
+      </w:rPr>
+    </w:lvl>
+    <w:lvl w:ilvl="2" w:tentative="1">
+      <w:start w:val="1"/>
+      <w:numFmt w:val="bullet"/>
+      <w:lvlText w:val=""/>
+      <w:lvlJc w:val="left"/>
+      <w:pPr>
+        <w:tabs>
+          <w:tab w:val="num" w:pos="2160"/>
+        </w:tabs>
+        <w:ind w:left="2160" w:hanging="360"/>
+      </w:pPr>
+      <w:rPr>
+        <w:rFonts w:ascii="Wingdings" w:hAnsi="Wingdings" w:hint="default"/>
+        <w:sz w:val="20"/>
+      </w:rPr>
+    </w:lvl>
+    <w:lvl w:ilvl="3" w:tentative="1">
+      <w:start w:val="1"/>
+      <w:numFmt w:val="bullet"/>
+      <w:lvlText w:val=""/>
+      <w:lvlJc w:val="left"/>
+      <w:pPr>
+        <w:tabs>
+          <w:tab w:val="num" w:pos="2880"/>
+        </w:tabs>
+        <w:ind w:left="2880" w:hanging="360"/>
+      </w:pPr>
+      <w:rPr>
+        <w:rFonts w:ascii="Wingdings" w:hAnsi="Wingdings" w:hint="default"/>
+        <w:sz w:val="20"/>
+      </w:rPr>
+    </w:lvl>
+    <w:lvl w:ilvl="4" w:tentative="1">
+      <w:start w:val="1"/>
+      <w:numFmt w:val="bullet"/>
+      <w:lvlText w:val=""/>
+      <w:lvlJc w:val="left"/>
+      <w:pPr>
+        <w:tabs>
+          <w:tab w:val="num" w:pos="3600"/>
+        </w:tabs>
+        <w:ind w:left="3600" w:hanging="360"/>
+      </w:pPr>
+      <w:rPr>
+        <w:rFonts w:ascii="Wingdings" w:hAnsi="Wingdings" w:hint="default"/>
+        <w:sz w:val="20"/>
+      </w:rPr>
+    </w:lvl>
+    <w:lvl w:ilvl="5" w:tentative="1">
+      <w:start w:val="1"/>
+      <w:numFmt w:val="bullet"/>
+      <w:lvlText w:val=""/>
+      <w:lvlJc w:val="left"/>
+      <w:pPr>
+        <w:tabs>
+          <w:tab w:val="num" w:pos="4320"/>
+        </w:tabs>
+        <w:ind w:left="4320" w:hanging="360"/>
+      </w:pPr>
+      <w:rPr>
+        <w:rFonts w:ascii="Wingdings" w:hAnsi="Wingdings" w:hint="default"/>
+        <w:sz w:val="20"/>
+      </w:rPr>
+    </w:lvl>
+    <w:lvl w:ilvl="6" w:tentative="1">
+      <w:start w:val="1"/>
+      <w:numFmt w:val="bullet"/>
+      <w:lvlText w:val=""/>
+      <w:lvlJc w:val="left"/>
+      <w:pPr>
+        <w:tabs>
+          <w:tab w:val="num" w:pos="5040"/>
+        </w:tabs>
+        <w:ind w:left="5040" w:hanging="360"/>
+      </w:pPr>
+      <w:rPr>
+        <w:rFonts w:ascii="Wingdings" w:hAnsi="Wingdings" w:hint="default"/>
+        <w:sz w:val="20"/>
+      </w:rPr>
+    </w:lvl>
+    <w:lvl w:ilvl="7" w:tentative="1">
+      <w:start w:val="1"/>
+      <w:numFmt w:val="bullet"/>
+      <w:lvlText w:val=""/>
+      <w:lvlJc w:val="left"/>
+      <w:pPr>
+        <w:tabs>
+          <w:tab w:val="num" w:pos="5760"/>
+        </w:tabs>
+        <w:ind w:left="5760" w:hanging="360"/>
+      </w:pPr>
+      <w:rPr>
+        <w:rFonts w:ascii="Wingdings" w:hAnsi="Wingdings" w:hint="default"/>
+        <w:sz w:val="20"/>
+      </w:rPr>
+    </w:lvl>
+    <w:lvl w:ilvl="8" w:tentative="1">
+      <w:start w:val="1"/>
+      <w:numFmt w:val="bullet"/>
+      <w:lvlText w:val=""/>
+      <w:lvlJc w:val="left"/>
+      <w:pPr>
+        <w:tabs>
+          <w:tab w:val="num" w:pos="6480"/>
+        </w:tabs>
+        <w:ind w:left="6480" w:hanging="360"/>
+      </w:pPr>
+      <w:rPr>
+        <w:rFonts w:ascii="Wingdings" w:hAnsi="Wingdings" w:hint="default"/>
+        <w:sz w:val="20"/>
+      </w:rPr>
+    </w:lvl>
+  </w:abstractNum>
+  <w:abstractNum w:abstractNumId="15" w15:restartNumberingAfterBreak="0">
     <w:nsid w:val="60C76D98"/>
     <w:multiLevelType w:val="multilevel"/>
     <w:tmpl w:val="70F296B6"/>
@@ -2783,7 +2916,7 @@
       </w:rPr>
     </w:lvl>
   </w:abstractNum>
-  <w:abstractNum w:abstractNumId="14" w15:restartNumberingAfterBreak="0">
+  <w:abstractNum w:abstractNumId="16" w15:restartNumberingAfterBreak="0">
     <w:nsid w:val="66162C26"/>
     <w:multiLevelType w:val="multilevel"/>
     <w:tmpl w:val="E93A0168"/>
@@ -2896,7 +3029,7 @@
       </w:pPr>
     </w:lvl>
   </w:abstractNum>
-  <w:abstractNum w:abstractNumId="15" w15:restartNumberingAfterBreak="0">
+  <w:abstractNum w:abstractNumId="17" w15:restartNumberingAfterBreak="0">
     <w:nsid w:val="79DB1444"/>
     <w:multiLevelType w:val="multilevel"/>
     <w:tmpl w:val="64463FD0"/>
@@ -3009,7 +3142,7 @@
       </w:pPr>
     </w:lvl>
   </w:abstractNum>
-  <w:abstractNum w:abstractNumId="16" w15:restartNumberingAfterBreak="0">
+  <w:abstractNum w:abstractNumId="18" w15:restartNumberingAfterBreak="0">
     <w:nsid w:val="7C5A698C"/>
     <w:multiLevelType w:val="multilevel"/>
     <w:tmpl w:val="C6DC7A5E"/>
@@ -3158,7 +3291,7 @@
       </w:rPr>
     </w:lvl>
   </w:abstractNum>
-  <w:abstractNum w:abstractNumId="17" w15:restartNumberingAfterBreak="0">
+  <w:abstractNum w:abstractNumId="19" w15:restartNumberingAfterBreak="0">
     <w:nsid w:val="7D9B68BD"/>
     <w:multiLevelType w:val="multilevel"/>
     <w:tmpl w:val="C5525EF4"/>
@@ -3308,58 +3441,64 @@
     </w:lvl>
   </w:abstractNum>
   <w:num w:numId="1" w16cid:durableId="532615140">
-    <w:abstractNumId w:val="17"/>
+    <w:abstractNumId w:val="19"/>
   </w:num>
   <w:num w:numId="2" w16cid:durableId="449203293">
+    <w:abstractNumId w:val="15"/>
+  </w:num>
+  <w:num w:numId="3" w16cid:durableId="2050689972">
+    <w:abstractNumId w:val="11"/>
+  </w:num>
+  <w:num w:numId="4" w16cid:durableId="1428816343">
+    <w:abstractNumId w:val="6"/>
+  </w:num>
+  <w:num w:numId="5" w16cid:durableId="1101800869">
+    <w:abstractNumId w:val="7"/>
+  </w:num>
+  <w:num w:numId="6" w16cid:durableId="103161959">
     <w:abstractNumId w:val="13"/>
   </w:num>
-  <w:num w:numId="3" w16cid:durableId="2050689972">
-    <w:abstractNumId w:val="10"/>
-  </w:num>
-  <w:num w:numId="4" w16cid:durableId="1428816343">
-    <w:abstractNumId w:val="5"/>
-  </w:num>
-  <w:num w:numId="5" w16cid:durableId="1101800869">
-    <w:abstractNumId w:val="6"/>
-  </w:num>
-  <w:num w:numId="6" w16cid:durableId="103161959">
+  <w:num w:numId="7" w16cid:durableId="678584912">
     <w:abstractNumId w:val="12"/>
   </w:num>
-  <w:num w:numId="7" w16cid:durableId="678584912">
-    <w:abstractNumId w:val="11"/>
-  </w:num>
   <w:num w:numId="8" w16cid:durableId="665400520">
-    <w:abstractNumId w:val="14"/>
+    <w:abstractNumId w:val="16"/>
   </w:num>
   <w:num w:numId="9" w16cid:durableId="125396374">
     <w:abstractNumId w:val="0"/>
   </w:num>
   <w:num w:numId="10" w16cid:durableId="1374890217">
-    <w:abstractNumId w:val="3"/>
+    <w:abstractNumId w:val="4"/>
   </w:num>
   <w:num w:numId="11" w16cid:durableId="1404330949">
-    <w:abstractNumId w:val="7"/>
+    <w:abstractNumId w:val="8"/>
   </w:num>
   <w:num w:numId="12" w16cid:durableId="2981180">
     <w:abstractNumId w:val="2"/>
   </w:num>
   <w:num w:numId="13" w16cid:durableId="1643535507">
-    <w:abstractNumId w:val="16"/>
+    <w:abstractNumId w:val="18"/>
   </w:num>
   <w:num w:numId="14" w16cid:durableId="168061073">
-    <w:abstractNumId w:val="8"/>
+    <w:abstractNumId w:val="9"/>
   </w:num>
   <w:num w:numId="15" w16cid:durableId="1959994664">
-    <w:abstractNumId w:val="9"/>
+    <w:abstractNumId w:val="10"/>
   </w:num>
   <w:num w:numId="16" w16cid:durableId="865826103">
-    <w:abstractNumId w:val="4"/>
+    <w:abstractNumId w:val="5"/>
   </w:num>
   <w:num w:numId="17" w16cid:durableId="1220943146">
     <w:abstractNumId w:val="1"/>
   </w:num>
   <w:num w:numId="18" w16cid:durableId="985277052">
-    <w:abstractNumId w:val="15"/>
+    <w:abstractNumId w:val="17"/>
+  </w:num>
+  <w:num w:numId="19" w16cid:durableId="147600072">
+    <w:abstractNumId w:val="3"/>
+  </w:num>
+  <w:num w:numId="20" w16cid:durableId="944190630">
+    <w:abstractNumId w:val="14"/>
   </w:num>
 </w:numbering>
 </file>
@@ -3975,6 +4114,7 @@
   <w:style w:type="character" w:default="1" w:styleId="Policepardfaut">
     <w:name w:val="Default Paragraph Font"/>
     <w:uiPriority w:val="1"/>
+    <w:semiHidden/>
     <w:unhideWhenUsed/>
   </w:style>
   <w:style w:type="table" w:default="1" w:styleId="TableauNormal">
@@ -4288,6 +4428,34 @@
       <w:spacing w:val="5"/>
     </w:rPr>
   </w:style>
+  <w:style w:type="character" w:styleId="lev">
+    <w:name w:val="Strong"/>
+    <w:basedOn w:val="Policepardfaut"/>
+    <w:uiPriority w:val="22"/>
+    <w:qFormat/>
+    <w:rsid w:val="0077414C"/>
+    <w:rPr>
+      <w:b/>
+      <w:bCs/>
+    </w:rPr>
+  </w:style>
+  <w:style w:type="paragraph" w:styleId="NormalWeb">
+    <w:name w:val="Normal (Web)"/>
+    <w:basedOn w:val="Normal"/>
+    <w:uiPriority w:val="99"/>
+    <w:semiHidden/>
+    <w:unhideWhenUsed/>
+    <w:rsid w:val="0077414C"/>
+    <w:pPr>
+      <w:spacing w:before="100" w:beforeAutospacing="1" w:after="100" w:afterAutospacing="1" w:line="240" w:lineRule="auto"/>
+    </w:pPr>
+    <w:rPr>
+      <w:rFonts w:ascii="Times New Roman" w:eastAsia="Times New Roman" w:hAnsi="Times New Roman" w:cs="Times New Roman"/>
+      <w:kern w:val="0"/>
+      <w:lang w:eastAsia="fr-FR"/>
+      <w14:ligatures w14:val="none"/>
+    </w:rPr>
+  </w:style>
 </w:styles>
 </file>
 

</xml_diff>